<commit_message>
docs: align project plan with revised PostgreSQL and AI architecture
</commit_message>
<xml_diff>
--- a/docs/project proposal.docx
+++ b/docs/project proposal.docx
@@ -248,7 +248,15 @@
         <w:t xml:space="preserve"> </w:t>
       </w:r>
       <w:r>
-        <w:t>历史价格、成交量和波动率能否帮助预测未来的价格方向？预测准确度如何？</w:t>
+        <w:t>历史价格、成交量和波动</w:t>
+      </w:r>
+      <w:proofErr w:type="gramStart"/>
+      <w:r>
+        <w:t>率能否</w:t>
+      </w:r>
+      <w:proofErr w:type="gramEnd"/>
+      <w:r>
+        <w:t>帮助预测未来的价格方向？预测准确度如何？</w:t>
       </w:r>
     </w:p>
     <w:p>
@@ -323,7 +331,7 @@
         <w:t>个人兴趣</w:t>
       </w:r>
       <w:r>
-        <w:t>你本身对</w:t>
+        <w:t>本身对</w:t>
       </w:r>
       <w:r>
         <w:t xml:space="preserve"> CS2 </w:t>
@@ -342,7 +350,7 @@
       </w:pPr>
       <w:r>
         <w:lastRenderedPageBreak/>
-        <w:t>你希望从</w:t>
+        <w:t>希望从</w:t>
       </w:r>
       <w:r>
         <w:t xml:space="preserve"> Data Engineering </w:t>
@@ -695,8 +703,13 @@
         </w:rPr>
         <w:t>，调用频率每小时一次，</w:t>
       </w:r>
-      <w:r>
-        <w:t>不细分具体</w:t>
+      <w:proofErr w:type="gramStart"/>
+      <w:r>
+        <w:t>不</w:t>
+      </w:r>
+      <w:proofErr w:type="gramEnd"/>
+      <w:r>
+        <w:t>细分具体</w:t>
       </w:r>
       <w:r>
         <w:t xml:space="preserve"> Float</w:t>
@@ -744,7 +757,21 @@
         <w:rPr>
           <w:rFonts w:hint="eastAsia"/>
         </w:rPr>
-        <w:t>获取方式与合规性</w:t>
+        <w:t>获取方式与合</w:t>
+      </w:r>
+      <w:proofErr w:type="gramStart"/>
+      <w:r>
+        <w:rPr>
+          <w:rFonts w:hint="eastAsia"/>
+        </w:rPr>
+        <w:t>规</w:t>
+      </w:r>
+      <w:proofErr w:type="gramEnd"/>
+      <w:r>
+        <w:rPr>
+          <w:rFonts w:hint="eastAsia"/>
+        </w:rPr>
+        <w:t>性</w:t>
       </w:r>
     </w:p>
     <w:p>
@@ -833,10 +860,10 @@
         </w:rPr>
         <w:lastRenderedPageBreak/>
         <w:drawing>
-          <wp:inline distT="0" distB="0" distL="0" distR="0" wp14:anchorId="0933E4AD" wp14:editId="1220AC71">
-            <wp:extent cx="5486400" cy="5624830"/>
-            <wp:effectExtent l="0" t="0" r="0" b="0"/>
-            <wp:docPr id="47509708" name="图片 1" descr="图片预览"/>
+          <wp:inline distT="0" distB="0" distL="0" distR="0" wp14:anchorId="4BC8F28D" wp14:editId="63BC672D">
+            <wp:extent cx="5486400" cy="4772660"/>
+            <wp:effectExtent l="0" t="0" r="0" b="8890"/>
+            <wp:docPr id="862869263" name="图片 1" descr="图片预览"/>
             <wp:cNvGraphicFramePr>
               <a:graphicFrameLocks xmlns:a="http://schemas.openxmlformats.org/drawingml/2006/main" noChangeAspect="1"/>
             </wp:cNvGraphicFramePr>
@@ -865,7 +892,7 @@
                   <pic:spPr bwMode="auto">
                     <a:xfrm>
                       <a:off x="0" y="0"/>
-                      <a:ext cx="5486400" cy="5624830"/>
+                      <a:ext cx="5486400" cy="4772660"/>
                     </a:xfrm>
                     <a:prstGeom prst="rect">
                       <a:avLst/>
@@ -885,6 +912,53 @@
     <w:p>
       <w:pPr>
         <w:pStyle w:val="a9"/>
+        <w:ind w:left="360"/>
+      </w:pPr>
+      <w:r>
+        <w:rPr>
+          <w:noProof/>
+        </w:rPr>
+        <w:lastRenderedPageBreak/>
+        <w:drawing>
+          <wp:inline distT="0" distB="0" distL="0" distR="0" wp14:anchorId="0D92640F" wp14:editId="3D2D4BB3">
+            <wp:extent cx="5486400" cy="3657600"/>
+            <wp:effectExtent l="0" t="0" r="0" b="0"/>
+            <wp:docPr id="912678192" name="图片 1"/>
+            <wp:cNvGraphicFramePr>
+              <a:graphicFrameLocks xmlns:a="http://schemas.openxmlformats.org/drawingml/2006/main" noChangeAspect="1"/>
+            </wp:cNvGraphicFramePr>
+            <a:graphic xmlns:a="http://schemas.openxmlformats.org/drawingml/2006/main">
+              <a:graphicData uri="http://schemas.openxmlformats.org/drawingml/2006/picture">
+                <pic:pic xmlns:pic="http://schemas.openxmlformats.org/drawingml/2006/picture">
+                  <pic:nvPicPr>
+                    <pic:cNvPr id="912678192" name=""/>
+                    <pic:cNvPicPr/>
+                  </pic:nvPicPr>
+                  <pic:blipFill>
+                    <a:blip r:embed="rId6"/>
+                    <a:stretch>
+                      <a:fillRect/>
+                    </a:stretch>
+                  </pic:blipFill>
+                  <pic:spPr>
+                    <a:xfrm>
+                      <a:off x="0" y="0"/>
+                      <a:ext cx="5486400" cy="3657600"/>
+                    </a:xfrm>
+                    <a:prstGeom prst="rect">
+                      <a:avLst/>
+                    </a:prstGeom>
+                  </pic:spPr>
+                </pic:pic>
+              </a:graphicData>
+            </a:graphic>
+          </wp:inline>
+        </w:drawing>
+      </w:r>
+    </w:p>
+    <w:p>
+      <w:pPr>
+        <w:pStyle w:val="a9"/>
         <w:numPr>
           <w:ilvl w:val="0"/>
           <w:numId w:val="3"/>
@@ -1122,63 +1196,67 @@
           </w:tcPr>
           <w:p>
             <w:r>
+              <w:t>数据采集架构</w:t>
+            </w:r>
+          </w:p>
+        </w:tc>
+        <w:tc>
+          <w:tcPr>
+            <w:tcW w:w="2153" w:type="dxa"/>
+          </w:tcPr>
+          <w:p>
+            <w:r>
+              <w:t>EventBridge + Lambda</w:t>
+            </w:r>
+          </w:p>
+        </w:tc>
+        <w:tc>
+          <w:tcPr>
+            <w:tcW w:w="1719" w:type="dxa"/>
+          </w:tcPr>
+          <w:p>
+            <w:r>
+              <w:t>EC2</w:t>
+            </w:r>
+            <w:r>
+              <w:t>、持续运行的服务</w:t>
+            </w:r>
+          </w:p>
+        </w:tc>
+        <w:tc>
+          <w:tcPr>
+            <w:tcW w:w="3463" w:type="dxa"/>
+          </w:tcPr>
+          <w:p>
+            <w:r>
+              <w:t>按需执行，减少服务器维护，但受</w:t>
+            </w:r>
+            <w:r>
+              <w:t xml:space="preserve"> Lambda </w:t>
+            </w:r>
+            <w:r>
+              <w:t>执行时</w:t>
+            </w:r>
+            <w:proofErr w:type="gramStart"/>
+            <w:r>
+              <w:t>长限制</w:t>
+            </w:r>
+            <w:proofErr w:type="gramEnd"/>
+          </w:p>
+        </w:tc>
+      </w:tr>
+      <w:tr>
+        <w:tc>
+          <w:tcPr>
+            <w:tcW w:w="1591" w:type="dxa"/>
+          </w:tcPr>
+          <w:p>
+            <w:r>
               <w:rPr>
                 <w:rFonts w:hint="eastAsia"/>
               </w:rPr>
-              <w:lastRenderedPageBreak/>
-              <w:t>计算架构</w:t>
-            </w:r>
-          </w:p>
-        </w:tc>
-        <w:tc>
-          <w:tcPr>
-            <w:tcW w:w="2153" w:type="dxa"/>
-          </w:tcPr>
-          <w:p>
-            <w:r>
-              <w:t>EventBridge + Lambda</w:t>
-            </w:r>
-          </w:p>
-        </w:tc>
-        <w:tc>
-          <w:tcPr>
-            <w:tcW w:w="1719" w:type="dxa"/>
-          </w:tcPr>
-          <w:p>
-            <w:r>
-              <w:t>EC2</w:t>
-            </w:r>
-            <w:r>
-              <w:t>、持续运行的服务</w:t>
-            </w:r>
-          </w:p>
-        </w:tc>
-        <w:tc>
-          <w:tcPr>
-            <w:tcW w:w="3463" w:type="dxa"/>
-          </w:tcPr>
-          <w:p>
-            <w:pPr>
-              <w:jc w:val="center"/>
-            </w:pPr>
-            <w:r>
-              <w:t>按需执行，免服务器维护，但受</w:t>
-            </w:r>
-            <w:r>
-              <w:t xml:space="preserve"> Lambda </w:t>
-            </w:r>
-            <w:r>
-              <w:t>运行限制</w:t>
-            </w:r>
-          </w:p>
-        </w:tc>
-      </w:tr>
-      <w:tr>
-        <w:tc>
-          <w:tcPr>
-            <w:tcW w:w="1591" w:type="dxa"/>
-          </w:tcPr>
-          <w:p>
+              <w:t>原始</w:t>
+            </w:r>
             <w:r>
               <w:rPr>
                 <w:rFonts w:hint="eastAsia"/>
@@ -1193,7 +1271,16 @@
           </w:tcPr>
           <w:p>
             <w:r>
-              <w:t>S3 Bronze/Silver/Gold + Athena</w:t>
+              <w:t>Amazon S3</w:t>
+            </w:r>
+            <w:r>
+              <w:t>（</w:t>
+            </w:r>
+            <w:r>
+              <w:t>Bronze</w:t>
+            </w:r>
+            <w:r>
+              <w:t>）</w:t>
             </w:r>
           </w:p>
         </w:tc>
@@ -1203,13 +1290,10 @@
           </w:tcPr>
           <w:p>
             <w:r>
-              <w:t>RDS PostgreSQL</w:t>
-            </w:r>
-            <w:r>
-              <w:t>、</w:t>
-            </w:r>
-            <w:r>
-              <w:t>Redshift</w:t>
+              <w:t>直接写入</w:t>
+            </w:r>
+            <w:r>
+              <w:t xml:space="preserve"> PostgreSQL</w:t>
             </w:r>
           </w:p>
         </w:tc>
@@ -1219,13 +1303,19 @@
           </w:tcPr>
           <w:p>
             <w:r>
-              <w:t>适合历史数据及分析查询，但查询延迟</w:t>
-            </w:r>
-            <w:r>
-              <w:rPr>
-                <w:rFonts w:hint="eastAsia"/>
-              </w:rPr>
-              <w:t>较高</w:t>
+              <w:t>保留原始</w:t>
+            </w:r>
+            <w:r>
+              <w:t xml:space="preserve"> JSON</w:t>
+            </w:r>
+            <w:r>
+              <w:t>，支持重新处理和</w:t>
+            </w:r>
+            <w:r>
+              <w:t xml:space="preserve"> Backfill</w:t>
+            </w:r>
+            <w:r>
+              <w:t>，但增加存储与数据管理成本</w:t>
             </w:r>
           </w:p>
         </w:tc>
@@ -1237,10 +1327,7 @@
           </w:tcPr>
           <w:p>
             <w:r>
-              <w:rPr>
-                <w:rFonts w:hint="eastAsia"/>
-              </w:rPr>
-              <w:t>数据展示</w:t>
+              <w:t>分析数据库</w:t>
             </w:r>
           </w:p>
         </w:tc>
@@ -1255,7 +1342,7 @@
               </w:tabs>
             </w:pPr>
             <w:r>
-              <w:t>S3 Gold Latest + Streamlit Cache</w:t>
+              <w:t>PostgreSQL</w:t>
             </w:r>
           </w:p>
         </w:tc>
@@ -1265,7 +1352,13 @@
           </w:tcPr>
           <w:p>
             <w:r>
-              <w:t>DynamoDB</w:t>
+              <w:t>Athena</w:t>
+            </w:r>
+            <w:r>
+              <w:t>、</w:t>
+            </w:r>
+            <w:r>
+              <w:t>Redshift</w:t>
             </w:r>
           </w:p>
         </w:tc>
@@ -1275,7 +1368,37 @@
           </w:tcPr>
           <w:p>
             <w:r>
-              <w:t>减少数据库费用，代价是缓存管理与查询扩展能力有限</w:t>
+              <w:t>支持关系建模、增量更新、</w:t>
+            </w:r>
+            <w:r>
+              <w:t xml:space="preserve">dbt </w:t>
+            </w:r>
+            <w:r>
+              <w:t>转换及低延迟查询；相比</w:t>
+            </w:r>
+            <w:r>
+              <w:t xml:space="preserve"> Athena </w:t>
+            </w:r>
+            <w:r>
+              <w:t>存在持续实例成本，但更适合</w:t>
+            </w:r>
+            <w:r>
+              <w:t xml:space="preserve"> Dashboard </w:t>
+            </w:r>
+            <w:r>
+              <w:t>和</w:t>
+            </w:r>
+            <w:r>
+              <w:t xml:space="preserve"> AI </w:t>
+            </w:r>
+            <w:r>
+              <w:t>查询；相比</w:t>
+            </w:r>
+            <w:r>
+              <w:t xml:space="preserve"> Redshift </w:t>
+            </w:r>
+            <w:r>
+              <w:t>更轻量，但大规模分析扩展能力较弱</w:t>
             </w:r>
           </w:p>
         </w:tc>
@@ -1287,10 +1410,8 @@
           </w:tcPr>
           <w:p>
             <w:r>
-              <w:rPr>
-                <w:rFonts w:hint="eastAsia"/>
-              </w:rPr>
-              <w:t>数据处理</w:t>
+              <w:lastRenderedPageBreak/>
+              <w:t>工作流编排</w:t>
             </w:r>
           </w:p>
         </w:tc>
@@ -1300,16 +1421,7 @@
           </w:tcPr>
           <w:p>
             <w:r>
-              <w:t>每小时轻量处理</w:t>
-            </w:r>
-            <w:r>
-              <w:t xml:space="preserve"> + </w:t>
-            </w:r>
-            <w:r>
-              <w:t>每日</w:t>
-            </w:r>
-            <w:r>
-              <w:t xml:space="preserve"> Glue ETL</w:t>
+              <w:t>Apache Airflow DAG</w:t>
             </w:r>
           </w:p>
         </w:tc>
@@ -1319,7 +1431,10 @@
           </w:tcPr>
           <w:p>
             <w:r>
-              <w:t>所有数据实时处理</w:t>
+              <w:t xml:space="preserve">EventBridge + Lambda </w:t>
+            </w:r>
+            <w:r>
+              <w:t>串联任务</w:t>
             </w:r>
           </w:p>
         </w:tc>
@@ -1329,7 +1444,253 @@
           </w:tcPr>
           <w:p>
             <w:r>
-              <w:t>同时满足最新价格与长期分析需求，但完整历史分析会延迟</w:t>
+              <w:t>支持任务依赖、重试、监控和</w:t>
+            </w:r>
+            <w:r>
+              <w:t xml:space="preserve"> Backfill</w:t>
+            </w:r>
+            <w:r>
+              <w:t>，但增加部署与维护复杂度</w:t>
+            </w:r>
+          </w:p>
+        </w:tc>
+      </w:tr>
+      <w:tr>
+        <w:tc>
+          <w:tcPr>
+            <w:tcW w:w="1591" w:type="dxa"/>
+          </w:tcPr>
+          <w:p>
+            <w:r>
+              <w:t>数据转换</w:t>
+            </w:r>
+          </w:p>
+        </w:tc>
+        <w:tc>
+          <w:tcPr>
+            <w:tcW w:w="2153" w:type="dxa"/>
+          </w:tcPr>
+          <w:p>
+            <w:r>
+              <w:t>Python + dbt</w:t>
+            </w:r>
+            <w:r>
+              <w:t>（</w:t>
+            </w:r>
+            <w:r>
+              <w:t>SQL</w:t>
+            </w:r>
+            <w:r>
+              <w:t>）</w:t>
+            </w:r>
+          </w:p>
+        </w:tc>
+        <w:tc>
+          <w:tcPr>
+            <w:tcW w:w="1719" w:type="dxa"/>
+          </w:tcPr>
+          <w:p>
+            <w:r>
+              <w:t>Glue PySpark</w:t>
+            </w:r>
+            <w:r>
+              <w:t>、纯</w:t>
+            </w:r>
+            <w:r>
+              <w:t xml:space="preserve"> Python ETL</w:t>
+            </w:r>
+          </w:p>
+        </w:tc>
+        <w:tc>
+          <w:tcPr>
+            <w:tcW w:w="3463" w:type="dxa"/>
+          </w:tcPr>
+          <w:p>
+            <w:r>
+              <w:t xml:space="preserve">Python </w:t>
+            </w:r>
+            <w:r>
+              <w:t>负责校验加载，</w:t>
+            </w:r>
+            <w:r>
+              <w:t xml:space="preserve">dbt </w:t>
+            </w:r>
+            <w:r>
+              <w:t>负责</w:t>
+            </w:r>
+            <w:r>
+              <w:t xml:space="preserve"> SQL Transformation </w:t>
+            </w:r>
+            <w:r>
+              <w:t>和测试；不使用分布式计算，但受</w:t>
+            </w:r>
+            <w:r>
+              <w:t xml:space="preserve"> PostgreSQL </w:t>
+            </w:r>
+            <w:r>
+              <w:t>处理能力限制</w:t>
+            </w:r>
+          </w:p>
+        </w:tc>
+      </w:tr>
+      <w:tr>
+        <w:tc>
+          <w:tcPr>
+            <w:tcW w:w="1591" w:type="dxa"/>
+          </w:tcPr>
+          <w:p>
+            <w:r>
+              <w:t>增量处理</w:t>
+            </w:r>
+          </w:p>
+        </w:tc>
+        <w:tc>
+          <w:tcPr>
+            <w:tcW w:w="2153" w:type="dxa"/>
+          </w:tcPr>
+          <w:p>
+            <w:r>
+              <w:t>时间戳去重</w:t>
+            </w:r>
+            <w:r>
+              <w:t xml:space="preserve"> + Incremental Load</w:t>
+            </w:r>
+          </w:p>
+        </w:tc>
+        <w:tc>
+          <w:tcPr>
+            <w:tcW w:w="1719" w:type="dxa"/>
+          </w:tcPr>
+          <w:p>
+            <w:proofErr w:type="gramStart"/>
+            <w:r>
+              <w:t>每次全</w:t>
+            </w:r>
+            <w:proofErr w:type="gramEnd"/>
+            <w:r>
+              <w:t>量覆盖</w:t>
+            </w:r>
+          </w:p>
+        </w:tc>
+        <w:tc>
+          <w:tcPr>
+            <w:tcW w:w="3463" w:type="dxa"/>
+          </w:tcPr>
+          <w:p>
+            <w:r>
+              <w:t>减少重复记录和处理成本，但需要处理迟到数据及历史修正</w:t>
+            </w:r>
+          </w:p>
+          <w:p/>
+        </w:tc>
+      </w:tr>
+      <w:tr>
+        <w:tc>
+          <w:tcPr>
+            <w:tcW w:w="1591" w:type="dxa"/>
+          </w:tcPr>
+          <w:p>
+            <w:r>
+              <w:t>历史数据恢复</w:t>
+            </w:r>
+          </w:p>
+        </w:tc>
+        <w:tc>
+          <w:tcPr>
+            <w:tcW w:w="2153" w:type="dxa"/>
+          </w:tcPr>
+          <w:p>
+            <w:r>
+              <w:t>S3 Raw Replay + Airflow Backfill DAG</w:t>
+            </w:r>
+          </w:p>
+        </w:tc>
+        <w:tc>
+          <w:tcPr>
+            <w:tcW w:w="1719" w:type="dxa"/>
+          </w:tcPr>
+          <w:p>
+            <w:r>
+              <w:t>手工补数、重新全量采集</w:t>
+            </w:r>
+          </w:p>
+          <w:p/>
+        </w:tc>
+        <w:tc>
+          <w:tcPr>
+            <w:tcW w:w="3463" w:type="dxa"/>
+          </w:tcPr>
+          <w:p>
+            <w:r>
+              <w:t>支持失败恢复与</w:t>
+            </w:r>
+            <w:proofErr w:type="gramStart"/>
+            <w:r>
+              <w:t>幂</w:t>
+            </w:r>
+            <w:proofErr w:type="gramEnd"/>
+            <w:r>
+              <w:t>等重跑，但需要管理批次状态和数据一致性</w:t>
+            </w:r>
+          </w:p>
+        </w:tc>
+      </w:tr>
+      <w:tr>
+        <w:tc>
+          <w:tcPr>
+            <w:tcW w:w="1591" w:type="dxa"/>
+          </w:tcPr>
+          <w:p>
+            <w:r>
+              <w:t>数据查询与</w:t>
+            </w:r>
+            <w:r>
+              <w:t xml:space="preserve"> AI</w:t>
+            </w:r>
+          </w:p>
+        </w:tc>
+        <w:tc>
+          <w:tcPr>
+            <w:tcW w:w="2153" w:type="dxa"/>
+          </w:tcPr>
+          <w:p>
+            <w:r>
+              <w:t>Streamlit + Read-only SQL Tools + AI Agent/RAG</w:t>
+            </w:r>
+          </w:p>
+        </w:tc>
+        <w:tc>
+          <w:tcPr>
+            <w:tcW w:w="1719" w:type="dxa"/>
+          </w:tcPr>
+          <w:p>
+            <w:r>
+              <w:t>仅</w:t>
+            </w:r>
+            <w:r>
+              <w:t xml:space="preserve"> Dashboard</w:t>
+            </w:r>
+            <w:r>
+              <w:t>、自由</w:t>
+            </w:r>
+            <w:r>
+              <w:t xml:space="preserve"> Text-to-SQL</w:t>
+            </w:r>
+          </w:p>
+        </w:tc>
+        <w:tc>
+          <w:tcPr>
+            <w:tcW w:w="3463" w:type="dxa"/>
+          </w:tcPr>
+          <w:p>
+            <w:r>
+              <w:t>支持传统查询及自然语言分析，但增加</w:t>
+            </w:r>
+            <w:r>
+              <w:t xml:space="preserve"> LLM </w:t>
+            </w:r>
+            <w:r>
+              <w:t>成本、权限控制和答案校验要求</w:t>
             </w:r>
           </w:p>
         </w:tc>
@@ -1386,13 +1747,7 @@
         <w:rPr>
           <w:rFonts w:hint="eastAsia"/>
         </w:rPr>
-        <w:t>4</w:t>
-      </w:r>
-      <w:r>
-        <w:rPr>
-          <w:rFonts w:hint="eastAsia"/>
-        </w:rPr>
-        <w:t>3</w:t>
+        <w:t>84</w:t>
       </w:r>
       <w:r>
         <w:rPr>
@@ -1537,16 +1892,19 @@
               <w:ind w:left="0"/>
             </w:pPr>
             <w:r>
-              <w:t>Lambda</w:t>
-            </w:r>
-            <w:r>
-              <w:t>、</w:t>
-            </w:r>
-            <w:r>
-              <w:t>EventBridge</w:t>
-            </w:r>
-            <w:r>
-              <w:t>，每小时采集全市场快照</w:t>
+              <w:t>EventBridge + Lambda</w:t>
+            </w:r>
+            <w:r>
+              <w:t>，每小时采集并将</w:t>
+            </w:r>
+            <w:r>
+              <w:t xml:space="preserve"> Raw JSON </w:t>
+            </w:r>
+            <w:r>
+              <w:t>存入</w:t>
+            </w:r>
+            <w:r>
+              <w:t xml:space="preserve"> S3</w:t>
             </w:r>
           </w:p>
         </w:tc>
@@ -1579,7 +1937,10 @@
               <w:ind w:left="0"/>
             </w:pPr>
             <w:r>
-              <w:t>Historical Data Ingestion</w:t>
+              <w:t xml:space="preserve">Historical </w:t>
+            </w:r>
+            <w:r>
+              <w:t>Backfill</w:t>
             </w:r>
           </w:p>
         </w:tc>
@@ -1593,7 +1954,229 @@
               <w:ind w:left="0"/>
             </w:pPr>
             <w:r>
-              <w:t>接入可用历史价格、批量回填、元数据同步</w:t>
+              <w:t>历史</w:t>
+            </w:r>
+            <w:r>
+              <w:t xml:space="preserve"> API </w:t>
+            </w:r>
+            <w:r>
+              <w:t>分批请求、</w:t>
+            </w:r>
+            <w:r>
+              <w:t>Checkpoint</w:t>
+            </w:r>
+            <w:r>
+              <w:t>、失败重试、</w:t>
+            </w:r>
+            <w:proofErr w:type="gramStart"/>
+            <w:r>
+              <w:t>幂</w:t>
+            </w:r>
+            <w:proofErr w:type="gramEnd"/>
+            <w:r>
+              <w:t>等补数</w:t>
+            </w:r>
+          </w:p>
+        </w:tc>
+        <w:tc>
+          <w:tcPr>
+            <w:tcW w:w="1560" w:type="dxa"/>
+          </w:tcPr>
+          <w:p>
+            <w:pPr>
+              <w:pStyle w:val="a9"/>
+              <w:ind w:left="0"/>
+            </w:pPr>
+            <w:r>
+              <w:rPr>
+                <w:rFonts w:hint="eastAsia"/>
+              </w:rPr>
+              <w:t>8</w:t>
+            </w:r>
+            <w:r>
+              <w:rPr>
+                <w:rFonts w:hint="eastAsia"/>
+              </w:rPr>
+              <w:t>h</w:t>
+            </w:r>
+          </w:p>
+        </w:tc>
+      </w:tr>
+      <w:tr>
+        <w:tc>
+          <w:tcPr>
+            <w:tcW w:w="2552" w:type="dxa"/>
+          </w:tcPr>
+          <w:p>
+            <w:pPr>
+              <w:pStyle w:val="a9"/>
+              <w:ind w:left="0"/>
+            </w:pPr>
+            <w:r>
+              <w:t>Data Storage &amp; Basic ETL</w:t>
+            </w:r>
+          </w:p>
+        </w:tc>
+        <w:tc>
+          <w:tcPr>
+            <w:tcW w:w="4819" w:type="dxa"/>
+          </w:tcPr>
+          <w:p>
+            <w:pPr>
+              <w:pStyle w:val="a9"/>
+              <w:tabs>
+                <w:tab w:val="left" w:pos="1636"/>
+              </w:tabs>
+              <w:ind w:left="0"/>
+            </w:pPr>
+            <w:r>
+              <w:t>S3 Raw Data</w:t>
+            </w:r>
+            <w:r>
+              <w:t>、</w:t>
+            </w:r>
+            <w:r>
+              <w:t xml:space="preserve">PostgreSQL </w:t>
+            </w:r>
+            <w:r>
+              <w:t>五张业务表、</w:t>
+            </w:r>
+            <w:r>
+              <w:t>PK/FK</w:t>
+            </w:r>
+            <w:r>
+              <w:t>、</w:t>
+            </w:r>
+            <w:r>
+              <w:t xml:space="preserve">Index </w:t>
+            </w:r>
+            <w:r>
+              <w:t>设计</w:t>
+            </w:r>
+            <w:r>
+              <w:tab/>
+            </w:r>
+          </w:p>
+        </w:tc>
+        <w:tc>
+          <w:tcPr>
+            <w:tcW w:w="1560" w:type="dxa"/>
+          </w:tcPr>
+          <w:p>
+            <w:pPr>
+              <w:pStyle w:val="a9"/>
+              <w:ind w:left="0"/>
+            </w:pPr>
+            <w:r>
+              <w:rPr>
+                <w:rFonts w:hint="eastAsia"/>
+              </w:rPr>
+              <w:t>8h</w:t>
+            </w:r>
+          </w:p>
+        </w:tc>
+      </w:tr>
+      <w:tr>
+        <w:tc>
+          <w:tcPr>
+            <w:tcW w:w="2552" w:type="dxa"/>
+          </w:tcPr>
+          <w:p>
+            <w:pPr>
+              <w:pStyle w:val="a9"/>
+              <w:ind w:left="0"/>
+            </w:pPr>
+            <w:r>
+              <w:t>Python Data Loading</w:t>
+            </w:r>
+          </w:p>
+        </w:tc>
+        <w:tc>
+          <w:tcPr>
+            <w:tcW w:w="4819" w:type="dxa"/>
+          </w:tcPr>
+          <w:p>
+            <w:pPr>
+              <w:tabs>
+                <w:tab w:val="left" w:pos="1636"/>
+              </w:tabs>
+            </w:pPr>
+            <w:r>
+              <w:t>JSON Validation</w:t>
+            </w:r>
+            <w:r>
+              <w:t>、字段转换、批量写入</w:t>
+            </w:r>
+            <w:r>
+              <w:t xml:space="preserve"> PostgreSQL Staging</w:t>
+            </w:r>
+          </w:p>
+        </w:tc>
+        <w:tc>
+          <w:tcPr>
+            <w:tcW w:w="1560" w:type="dxa"/>
+          </w:tcPr>
+          <w:p>
+            <w:pPr>
+              <w:pStyle w:val="a9"/>
+              <w:ind w:left="0"/>
+            </w:pPr>
+            <w:r>
+              <w:rPr>
+                <w:rFonts w:hint="eastAsia"/>
+              </w:rPr>
+              <w:t>7h</w:t>
+            </w:r>
+          </w:p>
+        </w:tc>
+      </w:tr>
+      <w:tr>
+        <w:tc>
+          <w:tcPr>
+            <w:tcW w:w="2552" w:type="dxa"/>
+          </w:tcPr>
+          <w:p>
+            <w:pPr>
+              <w:pStyle w:val="a9"/>
+              <w:ind w:left="0"/>
+            </w:pPr>
+            <w:r>
+              <w:t>dbt Transformation</w:t>
+            </w:r>
+          </w:p>
+        </w:tc>
+        <w:tc>
+          <w:tcPr>
+            <w:tcW w:w="4819" w:type="dxa"/>
+          </w:tcPr>
+          <w:p>
+            <w:pPr>
+              <w:pStyle w:val="a9"/>
+              <w:tabs>
+                <w:tab w:val="left" w:pos="1636"/>
+              </w:tabs>
+              <w:ind w:left="0"/>
+            </w:pPr>
+            <w:r>
+              <w:t>SQL Cleaning</w:t>
+            </w:r>
+            <w:r>
+              <w:t>、</w:t>
+            </w:r>
+            <w:r>
+              <w:t>Deduplication</w:t>
+            </w:r>
+            <w:r>
+              <w:t>、</w:t>
+            </w:r>
+            <w:r>
+              <w:t>Incremental Models</w:t>
+            </w:r>
+            <w:r>
+              <w:t>、</w:t>
+            </w:r>
+            <w:r>
+              <w:t>Daily Aggregation</w:t>
             </w:r>
           </w:p>
         </w:tc>
@@ -1626,7 +2209,7 @@
               <w:ind w:left="0"/>
             </w:pPr>
             <w:r>
-              <w:t>Data Storage &amp; Basic ETL</w:t>
+              <w:t>Airflow Orchestration</w:t>
             </w:r>
           </w:p>
         </w:tc>
@@ -1638,21 +2221,30 @@
             <w:pPr>
               <w:pStyle w:val="a9"/>
               <w:tabs>
-                <w:tab w:val="left" w:pos="1636"/>
+                <w:tab w:val="left" w:pos="2786"/>
               </w:tabs>
               <w:ind w:left="0"/>
             </w:pPr>
             <w:r>
-              <w:t>S3 Bronze/Silver</w:t>
-            </w:r>
-            <w:r>
-              <w:t>、基础清洗、</w:t>
-            </w:r>
-            <w:r>
-              <w:t>Parquet</w:t>
-            </w:r>
-            <w:r>
-              <w:tab/>
+              <w:t>ETL DAG</w:t>
+            </w:r>
+            <w:r>
+              <w:t>、</w:t>
+            </w:r>
+            <w:r>
+              <w:t>Backfill DAG</w:t>
+            </w:r>
+            <w:r>
+              <w:t>、</w:t>
+            </w:r>
+            <w:r>
+              <w:t>Task Dependencies</w:t>
+            </w:r>
+            <w:r>
+              <w:t>、</w:t>
+            </w:r>
+            <w:r>
+              <w:t>Retries</w:t>
             </w:r>
           </w:p>
         </w:tc>
@@ -1685,7 +2277,69 @@
               <w:ind w:left="0"/>
             </w:pPr>
             <w:r>
-              <w:t>Basic Query &amp; Dashboard</w:t>
+              <w:t>Data Quality &amp; Monitoring</w:t>
+            </w:r>
+          </w:p>
+        </w:tc>
+        <w:tc>
+          <w:tcPr>
+            <w:tcW w:w="4819" w:type="dxa"/>
+          </w:tcPr>
+          <w:p>
+            <w:pPr>
+              <w:pStyle w:val="a9"/>
+              <w:tabs>
+                <w:tab w:val="left" w:pos="1636"/>
+              </w:tabs>
+              <w:ind w:left="0"/>
+            </w:pPr>
+            <w:r>
+              <w:t>dbt Tests</w:t>
+            </w:r>
+            <w:r>
+              <w:t>、</w:t>
+            </w:r>
+            <w:r>
+              <w:t>CloudWatch Logs</w:t>
+            </w:r>
+            <w:r>
+              <w:t>、分层告警、</w:t>
+            </w:r>
+            <w:r>
+              <w:t>SNS Email</w:t>
+            </w:r>
+          </w:p>
+        </w:tc>
+        <w:tc>
+          <w:tcPr>
+            <w:tcW w:w="1560" w:type="dxa"/>
+          </w:tcPr>
+          <w:p>
+            <w:pPr>
+              <w:pStyle w:val="a9"/>
+              <w:ind w:left="0"/>
+            </w:pPr>
+            <w:r>
+              <w:rPr>
+                <w:rFonts w:hint="eastAsia"/>
+              </w:rPr>
+              <w:t>7h</w:t>
+            </w:r>
+          </w:p>
+        </w:tc>
+      </w:tr>
+      <w:tr>
+        <w:tc>
+          <w:tcPr>
+            <w:tcW w:w="2552" w:type="dxa"/>
+          </w:tcPr>
+          <w:p>
+            <w:pPr>
+              <w:pStyle w:val="a9"/>
+              <w:ind w:left="0"/>
+            </w:pPr>
+            <w:r>
+              <w:t>Basic Dashboard &amp; SQL Tools</w:t>
             </w:r>
           </w:p>
         </w:tc>
@@ -1700,28 +2354,16 @@
               </w:tabs>
             </w:pPr>
             <w:r>
-              <w:t xml:space="preserve">Athena </w:t>
-            </w:r>
-            <w:r>
-              <w:t>基础查询、</w:t>
-            </w:r>
-            <w:r>
               <w:t xml:space="preserve">Streamlit </w:t>
             </w:r>
             <w:r>
-              <w:t>搜索与最低价比较</w:t>
-            </w:r>
-          </w:p>
-          <w:p>
-            <w:pPr>
-              <w:pStyle w:val="a9"/>
-              <w:tabs>
-                <w:tab w:val="left" w:pos="1057"/>
-              </w:tabs>
-              <w:ind w:left="0"/>
-            </w:pPr>
-            <w:r>
-              <w:tab/>
+              <w:t>搜索、市场价格比较、历史数据查询、只读</w:t>
+            </w:r>
+            <w:r>
+              <w:t xml:space="preserve"> SQL </w:t>
+            </w:r>
+            <w:r>
+              <w:t>接口</w:t>
             </w:r>
           </w:p>
         </w:tc>
@@ -1751,9 +2393,73 @@
           <w:p>
             <w:pPr>
               <w:pStyle w:val="a9"/>
+              <w:ind w:left="0"/>
+            </w:pPr>
+            <w:r>
+              <w:t>AI Agent &amp; RAG Query</w:t>
+            </w:r>
+          </w:p>
+        </w:tc>
+        <w:tc>
+          <w:tcPr>
+            <w:tcW w:w="4819" w:type="dxa"/>
+          </w:tcPr>
+          <w:p>
+            <w:pPr>
+              <w:tabs>
+                <w:tab w:val="left" w:pos="1057"/>
+              </w:tabs>
+            </w:pPr>
+            <w:r>
+              <w:t>LLM Tool Calling</w:t>
+            </w:r>
+            <w:r>
+              <w:t>、</w:t>
+            </w:r>
+            <w:r>
+              <w:t xml:space="preserve">SQL </w:t>
+            </w:r>
+            <w:r>
+              <w:t>查询、</w:t>
+            </w:r>
+            <w:r>
+              <w:t xml:space="preserve">RAG </w:t>
+            </w:r>
+            <w:r>
+              <w:t>知识库、自然语言回答</w:t>
+            </w:r>
+          </w:p>
+        </w:tc>
+        <w:tc>
+          <w:tcPr>
+            <w:tcW w:w="1560" w:type="dxa"/>
+          </w:tcPr>
+          <w:p>
+            <w:pPr>
+              <w:pStyle w:val="a9"/>
+              <w:ind w:left="0"/>
+            </w:pPr>
+            <w:r>
+              <w:rPr>
+                <w:rFonts w:hint="eastAsia"/>
+              </w:rPr>
+              <w:t>11h</w:t>
+            </w:r>
+          </w:p>
+        </w:tc>
+      </w:tr>
+      <w:tr>
+        <w:tc>
+          <w:tcPr>
+            <w:tcW w:w="2552" w:type="dxa"/>
+          </w:tcPr>
+          <w:p>
+            <w:pPr>
+              <w:pStyle w:val="a9"/>
               <w:ind w:left="0" w:right="960"/>
             </w:pPr>
             <w:r>
+              <w:lastRenderedPageBreak/>
               <w:t xml:space="preserve">Testing &amp; </w:t>
             </w:r>
             <w:r>
@@ -1844,7 +2550,19 @@
         <w:rPr>
           <w:rFonts w:hint="eastAsia"/>
         </w:rPr>
-        <w:t>32h</w:t>
+        <w:t>3</w:t>
+      </w:r>
+      <w:r>
+        <w:rPr>
+          <w:rFonts w:hint="eastAsia"/>
+        </w:rPr>
+        <w:t>6</w:t>
+      </w:r>
+      <w:r>
+        <w:rPr>
+          <w:rFonts w:hint="eastAsia"/>
+        </w:rPr>
+        <w:t>h</w:t>
       </w:r>
     </w:p>
     <w:tbl>
@@ -1923,7 +2641,7 @@
               <w:ind w:left="0"/>
             </w:pPr>
             <w:r>
-              <w:t>Advanced ETL</w:t>
+              <w:t>Historical Analytics</w:t>
             </w:r>
           </w:p>
         </w:tc>
@@ -1933,16 +2651,19 @@
           </w:tcPr>
           <w:p>
             <w:r>
-              <w:t>Glue</w:t>
+              <w:t>价格变化率、</w:t>
+            </w:r>
+            <w:r>
+              <w:t>Moving Average</w:t>
             </w:r>
             <w:r>
               <w:t>、</w:t>
             </w:r>
             <w:r>
-              <w:t>PySpark</w:t>
-            </w:r>
-            <w:r>
-              <w:t>、增量处理、数据质量检查</w:t>
+              <w:t>Volatility</w:t>
+            </w:r>
+            <w:r>
+              <w:t>、历史趋势</w:t>
             </w:r>
           </w:p>
         </w:tc>
@@ -1975,7 +2696,7 @@
               <w:ind w:left="0"/>
             </w:pPr>
             <w:r>
-              <w:t>Historical Analytics</w:t>
+              <w:t>Market Comparison</w:t>
             </w:r>
           </w:p>
         </w:tc>
@@ -1984,12 +2705,51 @@
             <w:tcW w:w="4819" w:type="dxa"/>
           </w:tcPr>
           <w:p>
-            <w:pPr>
-              <w:pStyle w:val="a9"/>
-              <w:ind w:left="0"/>
-            </w:pPr>
-            <w:r>
-              <w:t>历史价格趋势、涨跌幅、移动平均、波动率</w:t>
+            <w:r>
+              <w:t>跨市场价差、最低价格排行、价格变化排行</w:t>
+            </w:r>
+          </w:p>
+        </w:tc>
+        <w:tc>
+          <w:tcPr>
+            <w:tcW w:w="1560" w:type="dxa"/>
+          </w:tcPr>
+          <w:p>
+            <w:pPr>
+              <w:pStyle w:val="a9"/>
+              <w:ind w:left="0"/>
+            </w:pPr>
+            <w:r>
+              <w:rPr>
+                <w:rFonts w:hint="eastAsia"/>
+              </w:rPr>
+              <w:t>6h</w:t>
+            </w:r>
+          </w:p>
+        </w:tc>
+      </w:tr>
+      <w:tr>
+        <w:tc>
+          <w:tcPr>
+            <w:tcW w:w="2552" w:type="dxa"/>
+          </w:tcPr>
+          <w:p>
+            <w:pPr>
+              <w:pStyle w:val="a9"/>
+              <w:ind w:left="0"/>
+            </w:pPr>
+            <w:r>
+              <w:t>Dashboard Enhancement</w:t>
+            </w:r>
+          </w:p>
+        </w:tc>
+        <w:tc>
+          <w:tcPr>
+            <w:tcW w:w="4819" w:type="dxa"/>
+          </w:tcPr>
+          <w:p>
+            <w:r>
+              <w:t>历史走势图、高级筛选、排行榜、交互式图表</w:t>
             </w:r>
           </w:p>
         </w:tc>
@@ -2022,7 +2782,7 @@
               <w:ind w:left="0"/>
             </w:pPr>
             <w:r>
-              <w:t>Market Comparison</w:t>
+              <w:t>AI Agent Enhancement</w:t>
             </w:r>
           </w:p>
         </w:tc>
@@ -2032,7 +2792,10 @@
           </w:tcPr>
           <w:p>
             <w:r>
-              <w:t>跨市场价差、最低价排行、价格变化排行</w:t>
+              <w:t>MCP / Tool Integration</w:t>
+            </w:r>
+            <w:r>
+              <w:t>、价格阈值提醒、主动通知</w:t>
             </w:r>
           </w:p>
         </w:tc>
@@ -2049,7 +2812,13 @@
               <w:rPr>
                 <w:rFonts w:hint="eastAsia"/>
               </w:rPr>
-              <w:t>6h</w:t>
+              <w:t>8</w:t>
+            </w:r>
+            <w:r>
+              <w:rPr>
+                <w:rFonts w:hint="eastAsia"/>
+              </w:rPr>
+              <w:t>h</w:t>
             </w:r>
           </w:p>
         </w:tc>
@@ -2065,7 +2834,7 @@
               <w:ind w:left="0"/>
             </w:pPr>
             <w:r>
-              <w:t>Dashboard Enhancement</w:t>
+              <w:t>Optimization &amp; Testing</w:t>
             </w:r>
           </w:p>
         </w:tc>
@@ -2082,7 +2851,16 @@
               <w:ind w:left="0"/>
             </w:pPr>
             <w:r>
-              <w:t>历史曲线、多条件筛选、排名、图表</w:t>
+              <w:t>SQL Indexes</w:t>
+            </w:r>
+            <w:r>
+              <w:t>、</w:t>
+            </w:r>
+            <w:r>
+              <w:t>Query Optimization</w:t>
+            </w:r>
+            <w:r>
+              <w:t>、数据验证及测试</w:t>
             </w:r>
             <w:r>
               <w:tab/>
@@ -2102,7 +2880,13 @@
               <w:rPr>
                 <w:rFonts w:hint="eastAsia"/>
               </w:rPr>
-              <w:t>10h</w:t>
+              <w:t>6</w:t>
+            </w:r>
+            <w:r>
+              <w:rPr>
+                <w:rFonts w:hint="eastAsia"/>
+              </w:rPr>
+              <w:t>h</w:t>
             </w:r>
           </w:p>
         </w:tc>
@@ -2144,7 +2928,19 @@
         <w:rPr>
           <w:rFonts w:hint="eastAsia"/>
         </w:rPr>
-        <w:t>32h</w:t>
+        <w:t>3</w:t>
+      </w:r>
+      <w:r>
+        <w:rPr>
+          <w:rFonts w:hint="eastAsia"/>
+        </w:rPr>
+        <w:t>8</w:t>
+      </w:r>
+      <w:r>
+        <w:rPr>
+          <w:rFonts w:hint="eastAsia"/>
+        </w:rPr>
+        <w:t>h</w:t>
       </w:r>
     </w:p>
     <w:tbl>
@@ -2233,7 +3029,7 @@
           </w:tcPr>
           <w:p>
             <w:r>
-              <w:t>成交活跃度、买卖价差、挂单指标</w:t>
+              <w:t>交易活跃度、买卖价差、流动性指标（取决于数据源可用性）</w:t>
             </w:r>
           </w:p>
         </w:tc>
@@ -2250,54 +3046,13 @@
               <w:rPr>
                 <w:rFonts w:hint="eastAsia"/>
               </w:rPr>
-              <w:t>7h</w:t>
-            </w:r>
-          </w:p>
-        </w:tc>
-      </w:tr>
-      <w:tr>
-        <w:tc>
-          <w:tcPr>
-            <w:tcW w:w="2552" w:type="dxa"/>
-          </w:tcPr>
-          <w:p>
-            <w:pPr>
-              <w:pStyle w:val="a9"/>
-              <w:ind w:left="0"/>
-            </w:pPr>
-            <w:r>
-              <w:t>Anomaly Detection</w:t>
-            </w:r>
-          </w:p>
-        </w:tc>
-        <w:tc>
-          <w:tcPr>
-            <w:tcW w:w="4819" w:type="dxa"/>
-          </w:tcPr>
-          <w:p>
-            <w:pPr>
-              <w:pStyle w:val="a9"/>
-              <w:ind w:left="0"/>
-            </w:pPr>
-            <w:r>
-              <w:t>异常价格变化、成交活跃度突变</w:t>
-            </w:r>
-          </w:p>
-        </w:tc>
-        <w:tc>
-          <w:tcPr>
-            <w:tcW w:w="1560" w:type="dxa"/>
-          </w:tcPr>
-          <w:p>
-            <w:pPr>
-              <w:pStyle w:val="a9"/>
-              <w:ind w:left="0"/>
-            </w:pPr>
+              <w:t>6</w:t>
+            </w:r>
             <w:r>
               <w:rPr>
                 <w:rFonts w:hint="eastAsia"/>
               </w:rPr>
-              <w:t>5h</w:t>
+              <w:t>h</w:t>
             </w:r>
           </w:p>
         </w:tc>
@@ -2313,7 +3068,7 @@
               <w:ind w:left="0"/>
             </w:pPr>
             <w:r>
-              <w:t>Price Forecasting</w:t>
+              <w:t>Anomaly Detection</w:t>
             </w:r>
           </w:p>
         </w:tc>
@@ -2322,8 +3077,12 @@
             <w:tcW w:w="4819" w:type="dxa"/>
           </w:tcPr>
           <w:p>
-            <w:r>
-              <w:t>特征工程、模型训练、时间序列回测</w:t>
+            <w:pPr>
+              <w:pStyle w:val="a9"/>
+              <w:ind w:left="0"/>
+            </w:pPr>
+            <w:r>
+              <w:t>价格异常变化检测、异常阈值、统计方法</w:t>
             </w:r>
           </w:p>
         </w:tc>
@@ -2340,12 +3099,21 @@
               <w:rPr>
                 <w:rFonts w:hint="eastAsia"/>
               </w:rPr>
-              <w:t>15h</w:t>
+              <w:t>6</w:t>
+            </w:r>
+            <w:r>
+              <w:rPr>
+                <w:rFonts w:hint="eastAsia"/>
+              </w:rPr>
+              <w:t>h</w:t>
             </w:r>
           </w:p>
         </w:tc>
       </w:tr>
       <w:tr>
+        <w:trPr>
+          <w:trHeight w:val="189"/>
+        </w:trPr>
         <w:tc>
           <w:tcPr>
             <w:tcW w:w="2552" w:type="dxa"/>
@@ -2356,7 +3124,65 @@
               <w:ind w:left="0"/>
             </w:pPr>
             <w:r>
-              <w:t>Dashboard &amp; Evaluation</w:t>
+              <w:t>Price Forecasting</w:t>
+            </w:r>
+          </w:p>
+        </w:tc>
+        <w:tc>
+          <w:tcPr>
+            <w:tcW w:w="4819" w:type="dxa"/>
+          </w:tcPr>
+          <w:p>
+            <w:r>
+              <w:t>Feature Engineering</w:t>
+            </w:r>
+            <w:r>
+              <w:t>、时间序列模型、价格趋势预测</w:t>
+            </w:r>
+          </w:p>
+        </w:tc>
+        <w:tc>
+          <w:tcPr>
+            <w:tcW w:w="1560" w:type="dxa"/>
+          </w:tcPr>
+          <w:p>
+            <w:pPr>
+              <w:pStyle w:val="a9"/>
+              <w:ind w:left="0"/>
+            </w:pPr>
+            <w:r>
+              <w:rPr>
+                <w:rFonts w:hint="eastAsia"/>
+              </w:rPr>
+              <w:t>1</w:t>
+            </w:r>
+            <w:r>
+              <w:rPr>
+                <w:rFonts w:hint="eastAsia"/>
+              </w:rPr>
+              <w:t>4</w:t>
+            </w:r>
+            <w:r>
+              <w:rPr>
+                <w:rFonts w:hint="eastAsia"/>
+              </w:rPr>
+              <w:t>h</w:t>
+            </w:r>
+          </w:p>
+        </w:tc>
+      </w:tr>
+      <w:tr>
+        <w:tc>
+          <w:tcPr>
+            <w:tcW w:w="2552" w:type="dxa"/>
+          </w:tcPr>
+          <w:p>
+            <w:pPr>
+              <w:pStyle w:val="a9"/>
+              <w:ind w:left="0"/>
+            </w:pPr>
+            <w:r>
+              <w:t>Model Evaluation</w:t>
             </w:r>
           </w:p>
         </w:tc>
@@ -2373,10 +3199,16 @@
               <w:ind w:left="0"/>
             </w:pPr>
             <w:r>
-              <w:t>预测结果展示、误差分析、测试</w:t>
-            </w:r>
-            <w:r>
-              <w:tab/>
+              <w:t>Backtesting</w:t>
+            </w:r>
+            <w:r>
+              <w:t>、</w:t>
+            </w:r>
+            <w:r>
+              <w:t>MAE/RMSE</w:t>
+            </w:r>
+            <w:r>
+              <w:t>、与基线模型比较</w:t>
             </w:r>
           </w:p>
         </w:tc>
@@ -2393,7 +3225,70 @@
               <w:rPr>
                 <w:rFonts w:hint="eastAsia"/>
               </w:rPr>
-              <w:t>5h</w:t>
+              <w:t>8</w:t>
+            </w:r>
+            <w:r>
+              <w:rPr>
+                <w:rFonts w:hint="eastAsia"/>
+              </w:rPr>
+              <w:t>h</w:t>
+            </w:r>
+          </w:p>
+        </w:tc>
+      </w:tr>
+      <w:tr>
+        <w:tc>
+          <w:tcPr>
+            <w:tcW w:w="2552" w:type="dxa"/>
+          </w:tcPr>
+          <w:p>
+            <w:pPr>
+              <w:pStyle w:val="a9"/>
+              <w:ind w:left="0"/>
+            </w:pPr>
+            <w:r>
+              <w:t>Dashboard Integration</w:t>
+            </w:r>
+          </w:p>
+        </w:tc>
+        <w:tc>
+          <w:tcPr>
+            <w:tcW w:w="4819" w:type="dxa"/>
+          </w:tcPr>
+          <w:p>
+            <w:pPr>
+              <w:tabs>
+                <w:tab w:val="left" w:pos="1636"/>
+              </w:tabs>
+            </w:pPr>
+            <w:r>
+              <w:t>预测结果、异常标记、模型表现展示</w:t>
+            </w:r>
+          </w:p>
+          <w:p>
+            <w:pPr>
+              <w:pStyle w:val="a9"/>
+              <w:tabs>
+                <w:tab w:val="left" w:pos="1636"/>
+              </w:tabs>
+              <w:ind w:left="0"/>
+            </w:pPr>
+          </w:p>
+        </w:tc>
+        <w:tc>
+          <w:tcPr>
+            <w:tcW w:w="1560" w:type="dxa"/>
+          </w:tcPr>
+          <w:p>
+            <w:pPr>
+              <w:pStyle w:val="a9"/>
+              <w:ind w:left="0"/>
+            </w:pPr>
+            <w:r>
+              <w:rPr>
+                <w:rFonts w:hint="eastAsia"/>
+              </w:rPr>
+              <w:t>4h</w:t>
             </w:r>
           </w:p>
         </w:tc>
@@ -2420,7 +3315,6 @@
         </w:numPr>
       </w:pPr>
       <w:r>
-        <w:lastRenderedPageBreak/>
         <w:t xml:space="preserve">API </w:t>
       </w:r>
       <w:r>
@@ -2433,13 +3327,16 @@
         <w:t xml:space="preserve">: </w:t>
       </w:r>
       <w:r>
-        <w:t>重试、接口监控、保留历史快照、隔离数据源接口</w:t>
-      </w:r>
-      <w:r>
-        <w:rPr>
-          <w:rFonts w:hint="eastAsia"/>
-        </w:rPr>
-        <w:t>，更换数据源</w:t>
+        <w:t xml:space="preserve">API </w:t>
+      </w:r>
+      <w:r>
+        <w:t>重试、响应字段校验、状态监控、</w:t>
+      </w:r>
+      <w:r>
+        <w:t xml:space="preserve">S3 Raw Data </w:t>
+      </w:r>
+      <w:r>
+        <w:t>留存；必要时调整数据源</w:t>
       </w:r>
     </w:p>
     <w:p>
@@ -2451,10 +3348,7 @@
         </w:numPr>
       </w:pPr>
       <w:r>
-        <w:t xml:space="preserve">AWS </w:t>
-      </w:r>
-      <w:r>
-        <w:t>运行费用超出预算</w:t>
+        <w:t>数据缺失或更新延迟</w:t>
       </w:r>
       <w:r>
         <w:rPr>
@@ -2463,16 +3357,19 @@
         <w:t>：</w:t>
       </w:r>
       <w:r>
-        <w:t>AWS Budgets</w:t>
-      </w:r>
-      <w:r>
-        <w:t>、</w:t>
-      </w:r>
-      <w:r>
-        <w:t>Parquet</w:t>
-      </w:r>
-      <w:r>
-        <w:t>、限制扫描量与计算时间</w:t>
+        <w:t>检查</w:t>
+      </w:r>
+      <w:r>
+        <w:t xml:space="preserve"> Source Timestamp</w:t>
+      </w:r>
+      <w:r>
+        <w:t>、记录缺失比例、根据市场设置</w:t>
+      </w:r>
+      <w:r>
+        <w:t xml:space="preserve"> Freshness Threshold</w:t>
+      </w:r>
+      <w:r>
+        <w:t>，避免展示过期报价</w:t>
       </w:r>
     </w:p>
     <w:p>
@@ -2484,7 +3381,10 @@
         </w:numPr>
       </w:pPr>
       <w:r>
-        <w:t>流动性分析或预测结果不可靠</w:t>
+        <w:t xml:space="preserve">ETL </w:t>
+      </w:r>
+      <w:r>
+        <w:t>失败或重复处理</w:t>
       </w:r>
       <w:r>
         <w:rPr>
@@ -2493,7 +3393,34 @@
         <w:t>：</w:t>
       </w:r>
       <w:r>
-        <w:t>数据量筛选、基线比较、回测、标明不确定性</w:t>
+        <w:t>Airflow Task Retries</w:t>
+      </w:r>
+      <w:r>
+        <w:t>、</w:t>
+      </w:r>
+      <w:r>
+        <w:t>dbt Tests</w:t>
+      </w:r>
+      <w:r>
+        <w:t>、</w:t>
+      </w:r>
+      <w:r>
+        <w:t>Incremental Load</w:t>
+      </w:r>
+      <w:r>
+        <w:t>、幂等去重；通过</w:t>
+      </w:r>
+      <w:r>
+        <w:t xml:space="preserve"> S3 Replay </w:t>
+      </w:r>
+      <w:r>
+        <w:t>和</w:t>
+      </w:r>
+      <w:r>
+        <w:t xml:space="preserve"> Backfill </w:t>
+      </w:r>
+      <w:r>
+        <w:t>恢复</w:t>
       </w:r>
     </w:p>
     <w:p>
@@ -2505,7 +3432,10 @@
         </w:numPr>
       </w:pPr>
       <w:r>
-        <w:t>市场数据缺失或更新延迟</w:t>
+        <w:t xml:space="preserve">PostgreSQL </w:t>
+      </w:r>
+      <w:r>
+        <w:t>存储与查询性能</w:t>
       </w:r>
       <w:r>
         <w:rPr>
@@ -2514,7 +3444,134 @@
         <w:t>：</w:t>
       </w:r>
       <w:r>
-        <w:t>检查时间戳、过滤过期报价、记录缺失比例</w:t>
+        <w:t>仅保存必要历史记录、</w:t>
+      </w:r>
+      <w:r>
+        <w:t>Indexes</w:t>
+      </w:r>
+      <w:r>
+        <w:t>、批量写入、定期监测表大小；必要时增加</w:t>
+      </w:r>
+      <w:r>
+        <w:t xml:space="preserve"> Partitioning</w:t>
+      </w:r>
+    </w:p>
+    <w:p>
+      <w:pPr>
+        <w:pStyle w:val="a9"/>
+        <w:numPr>
+          <w:ilvl w:val="1"/>
+          <w:numId w:val="3"/>
+        </w:numPr>
+      </w:pPr>
+      <w:r>
+        <w:t xml:space="preserve">AWS </w:t>
+      </w:r>
+      <w:r>
+        <w:t>运行费用超出预算</w:t>
+      </w:r>
+      <w:r>
+        <w:rPr>
+          <w:rFonts w:hint="eastAsia"/>
+        </w:rPr>
+        <w:t>：</w:t>
+      </w:r>
+      <w:r>
+        <w:t>AWS Budgets</w:t>
+      </w:r>
+      <w:r>
+        <w:t>、限制</w:t>
+      </w:r>
+      <w:r>
+        <w:t xml:space="preserve"> Lambda </w:t>
+      </w:r>
+      <w:r>
+        <w:t>调用、控制</w:t>
+      </w:r>
+      <w:r>
+        <w:t xml:space="preserve"> S3 </w:t>
+      </w:r>
+      <w:r>
+        <w:t>保留策略、评估</w:t>
+      </w:r>
+      <w:r>
+        <w:t xml:space="preserve"> RDS </w:t>
+      </w:r>
+      <w:r>
+        <w:t>和</w:t>
+      </w:r>
+      <w:r>
+        <w:t xml:space="preserve"> Airflow </w:t>
+      </w:r>
+      <w:r>
+        <w:t>持续运行费用</w:t>
+      </w:r>
+    </w:p>
+    <w:p>
+      <w:pPr>
+        <w:pStyle w:val="a9"/>
+        <w:numPr>
+          <w:ilvl w:val="1"/>
+          <w:numId w:val="3"/>
+        </w:numPr>
+      </w:pPr>
+      <w:r>
+        <w:t xml:space="preserve">AI </w:t>
+      </w:r>
+      <w:r>
+        <w:t>查询错误或安全风险</w:t>
+      </w:r>
+      <w:r>
+        <w:rPr>
+          <w:rFonts w:hint="eastAsia"/>
+        </w:rPr>
+        <w:t>：</w:t>
+      </w:r>
+      <w:r>
+        <w:t>Read-only SQL Tools</w:t>
+      </w:r>
+      <w:r>
+        <w:t>、参数化查询、</w:t>
+      </w:r>
+      <w:r>
+        <w:t xml:space="preserve">SQL </w:t>
+      </w:r>
+      <w:r>
+        <w:t>白名单、超时和返回行数限制；用实际查询结果核对</w:t>
+      </w:r>
+      <w:r>
+        <w:t xml:space="preserve"> AI </w:t>
+      </w:r>
+      <w:r>
+        <w:t>回答</w:t>
+      </w:r>
+    </w:p>
+    <w:p>
+      <w:pPr>
+        <w:pStyle w:val="a9"/>
+        <w:numPr>
+          <w:ilvl w:val="1"/>
+          <w:numId w:val="3"/>
+        </w:numPr>
+      </w:pPr>
+      <w:r>
+        <w:lastRenderedPageBreak/>
+        <w:t>分析与预测结果不可靠</w:t>
+      </w:r>
+      <w:r>
+        <w:rPr>
+          <w:rFonts w:hint="eastAsia"/>
+        </w:rPr>
+        <w:t>：</w:t>
+      </w:r>
+      <w:r>
+        <w:t>数据完整性检查、异常值标记、基线模型比较、</w:t>
+      </w:r>
+      <w:r>
+        <w:t>Backtesting</w:t>
+      </w:r>
+      <w:r>
+        <w:t>，并明确数据来源和预测局限</w:t>
       </w:r>
     </w:p>
     <w:p>
@@ -2532,192 +3589,507 @@
         <w:t>可观测与告警</w:t>
       </w:r>
     </w:p>
-    <w:p>
-      <w:pPr>
-        <w:pStyle w:val="a9"/>
-        <w:numPr>
-          <w:ilvl w:val="1"/>
-          <w:numId w:val="3"/>
-        </w:numPr>
-      </w:pPr>
-      <w:r>
-        <w:t xml:space="preserve">Data Ingestion Monitoring — </w:t>
-      </w:r>
-      <w:r>
-        <w:t>数据采集监控</w:t>
-      </w:r>
-      <w:r>
-        <w:rPr>
-          <w:rFonts w:hint="eastAsia"/>
-        </w:rPr>
-        <w:t>：</w:t>
-      </w:r>
-      <w:r>
-        <w:t xml:space="preserve">90 </w:t>
-      </w:r>
-      <w:r>
-        <w:t>分钟没有成功采集就触发告警。</w:t>
-      </w:r>
-      <w:r>
-        <w:t>由独立检查任务定期检查最后一次成功发布快照的时间，并通过告警与</w:t>
-      </w:r>
-      <w:r>
-        <w:t xml:space="preserve"> SNS </w:t>
-      </w:r>
-      <w:r>
-        <w:t>发送邮件。</w:t>
-      </w:r>
-    </w:p>
-    <w:p>
-      <w:pPr>
-        <w:pStyle w:val="a9"/>
-        <w:numPr>
-          <w:ilvl w:val="1"/>
-          <w:numId w:val="3"/>
-        </w:numPr>
-      </w:pPr>
-      <w:r>
-        <w:t xml:space="preserve">Data Quality Monitoring — </w:t>
-      </w:r>
-      <w:r>
-        <w:t>数据质量监控</w:t>
-      </w:r>
-      <w:r>
-        <w:rPr>
-          <w:rFonts w:hint="eastAsia"/>
-        </w:rPr>
-        <w:t>：</w:t>
-      </w:r>
-      <w:r>
-        <w:t>初期可以用</w:t>
-      </w:r>
-      <w:r>
-        <w:t xml:space="preserve"> Python </w:t>
-      </w:r>
-      <w:r>
-        <w:t>实现这些检查，并记录在</w:t>
-      </w:r>
-      <w:r>
-        <w:t xml:space="preserve"> CloudWatch Logs </w:t>
-      </w:r>
-      <w:r>
-        <w:t>中。</w:t>
-      </w:r>
-      <w:r>
-        <w:t xml:space="preserve">V2 </w:t>
-      </w:r>
-      <w:r>
-        <w:t>再增加</w:t>
-      </w:r>
-      <w:r>
-        <w:t xml:space="preserve"> Glue Data Quality </w:t>
-      </w:r>
-      <w:r>
-        <w:t>或更完整的数据质量规则。</w:t>
-      </w:r>
-      <w:r>
-        <w:t xml:space="preserve">AWS Glue Data Quality </w:t>
-      </w:r>
-      <w:r>
-        <w:t>支持将规则通过率和失败数发送到</w:t>
-      </w:r>
-      <w:r>
-        <w:t xml:space="preserve"> CloudWatch</w:t>
-      </w:r>
-      <w:r>
-        <w:t>。</w:t>
-      </w:r>
-    </w:p>
-    <w:p>
-      <w:pPr>
-        <w:pStyle w:val="a9"/>
-        <w:numPr>
-          <w:ilvl w:val="1"/>
-          <w:numId w:val="3"/>
-        </w:numPr>
-      </w:pPr>
-      <w:r>
-        <w:t xml:space="preserve">Pipeline &amp; Performance Monitoring — </w:t>
-      </w:r>
-      <w:r>
-        <w:t>数据处理性能</w:t>
-      </w:r>
-      <w:r>
-        <w:rPr>
-          <w:rFonts w:hint="eastAsia"/>
-        </w:rPr>
-        <w:t>：</w:t>
-      </w:r>
-      <w:r>
-        <w:t>通过</w:t>
-      </w:r>
-      <w:r>
-        <w:t xml:space="preserve"> CloudWatch </w:t>
-      </w:r>
-      <w:r>
-        <w:t>查看，包括运行资源、处理数据量等。</w:t>
-      </w:r>
-    </w:p>
-    <w:p>
-      <w:pPr>
-        <w:pStyle w:val="a9"/>
-        <w:numPr>
-          <w:ilvl w:val="1"/>
-          <w:numId w:val="3"/>
-        </w:numPr>
-      </w:pPr>
-      <w:r>
-        <w:t xml:space="preserve">AWS Cost Monitoring — </w:t>
-      </w:r>
-      <w:r>
-        <w:t>成本监控</w:t>
-      </w:r>
-      <w:r>
-        <w:rPr>
-          <w:rFonts w:hint="eastAsia"/>
-        </w:rPr>
-        <w:t>：</w:t>
-      </w:r>
-      <w:r>
-        <w:rPr>
-          <w:rFonts w:hint="eastAsia"/>
-        </w:rPr>
-        <w:t>$</w:t>
-      </w:r>
-      <w:r>
-        <w:rPr>
-          <w:rFonts w:hint="eastAsia"/>
-        </w:rPr>
-        <w:t>10</w:t>
-      </w:r>
-      <w:r>
-        <w:rPr>
-          <w:rFonts w:hint="eastAsia"/>
-        </w:rPr>
-        <w:t>收到邮件警告，</w:t>
-      </w:r>
-      <w:r>
-        <w:rPr>
-          <w:rFonts w:hint="eastAsia"/>
-        </w:rPr>
-        <w:t>$</w:t>
-      </w:r>
-      <w:r>
-        <w:rPr>
-          <w:rFonts w:hint="eastAsia"/>
-        </w:rPr>
-        <w:t>25</w:t>
-      </w:r>
-      <w:r>
-        <w:rPr>
-          <w:rFonts w:hint="eastAsia"/>
-        </w:rPr>
-        <w:t>收到</w:t>
-      </w:r>
-      <w:r>
-        <w:t>High-Cost Alert</w:t>
-      </w:r>
-    </w:p>
+    <w:tbl>
+      <w:tblPr>
+        <w:tblStyle w:val="af"/>
+        <w:tblW w:w="8784" w:type="dxa"/>
+        <w:tblLook w:val="04A0" w:firstRow="1" w:lastRow="0" w:firstColumn="1" w:lastColumn="0" w:noHBand="0" w:noVBand="1"/>
+      </w:tblPr>
+      <w:tblGrid>
+        <w:gridCol w:w="1838"/>
+        <w:gridCol w:w="1843"/>
+        <w:gridCol w:w="2693"/>
+        <w:gridCol w:w="2410"/>
+      </w:tblGrid>
+      <w:tr>
+        <w:trPr>
+          <w:trHeight w:val="406"/>
+        </w:trPr>
+        <w:tc>
+          <w:tcPr>
+            <w:tcW w:w="1838" w:type="dxa"/>
+          </w:tcPr>
+          <w:p>
+            <w:r>
+              <w:t>监控项目</w:t>
+            </w:r>
+          </w:p>
+        </w:tc>
+        <w:tc>
+          <w:tcPr>
+            <w:tcW w:w="1843" w:type="dxa"/>
+          </w:tcPr>
+          <w:p>
+            <w:r>
+              <w:t>使用技术</w:t>
+            </w:r>
+          </w:p>
+        </w:tc>
+        <w:tc>
+          <w:tcPr>
+            <w:tcW w:w="2693" w:type="dxa"/>
+          </w:tcPr>
+          <w:p>
+            <w:r>
+              <w:t>监控指标与检查内容</w:t>
+            </w:r>
+          </w:p>
+        </w:tc>
+        <w:tc>
+          <w:tcPr>
+            <w:tcW w:w="2410" w:type="dxa"/>
+          </w:tcPr>
+          <w:p>
+            <w:r>
+              <w:t>异常处理与告警</w:t>
+            </w:r>
+          </w:p>
+        </w:tc>
+      </w:tr>
+      <w:tr>
+        <w:tc>
+          <w:tcPr>
+            <w:tcW w:w="1838" w:type="dxa"/>
+          </w:tcPr>
+          <w:p>
+            <w:r>
+              <w:t>Data Ingestion Monitoring</w:t>
+            </w:r>
+          </w:p>
+        </w:tc>
+        <w:tc>
+          <w:tcPr>
+            <w:tcW w:w="1843" w:type="dxa"/>
+          </w:tcPr>
+          <w:p>
+            <w:r>
+              <w:t>AWS CloudWatch</w:t>
+            </w:r>
+            <w:r>
+              <w:t>、</w:t>
+            </w:r>
+            <w:r>
+              <w:t>Lambda</w:t>
+            </w:r>
+            <w:r>
+              <w:t>、</w:t>
+            </w:r>
+            <w:r>
+              <w:t>SNS</w:t>
+            </w:r>
+          </w:p>
+        </w:tc>
+        <w:tc>
+          <w:tcPr>
+            <w:tcW w:w="2693" w:type="dxa"/>
+          </w:tcPr>
+          <w:p>
+            <w:r>
+              <w:t xml:space="preserve">API </w:t>
+            </w:r>
+            <w:r>
+              <w:t>请求成功率、采集记录数量、</w:t>
+            </w:r>
+            <w:r>
+              <w:t xml:space="preserve">S3 </w:t>
+            </w:r>
+            <w:r>
+              <w:t>文件生成状态、最后成功采集时间</w:t>
+            </w:r>
+          </w:p>
+        </w:tc>
+        <w:tc>
+          <w:tcPr>
+            <w:tcW w:w="2410" w:type="dxa"/>
+          </w:tcPr>
+          <w:p>
+            <w:r>
+              <w:t>采集失败自动重试；</w:t>
+            </w:r>
+            <w:r>
+              <w:t xml:space="preserve">90 </w:t>
+            </w:r>
+            <w:r>
+              <w:t>分钟内未成功采集则通过</w:t>
+            </w:r>
+            <w:r>
+              <w:t xml:space="preserve"> SNS </w:t>
+            </w:r>
+            <w:r>
+              <w:t>发送邮件</w:t>
+            </w:r>
+          </w:p>
+        </w:tc>
+      </w:tr>
+      <w:tr>
+        <w:tc>
+          <w:tcPr>
+            <w:tcW w:w="1838" w:type="dxa"/>
+          </w:tcPr>
+          <w:p>
+            <w:r>
+              <w:t>Data Quality Monitoring</w:t>
+            </w:r>
+          </w:p>
+        </w:tc>
+        <w:tc>
+          <w:tcPr>
+            <w:tcW w:w="1843" w:type="dxa"/>
+          </w:tcPr>
+          <w:p>
+            <w:r>
+              <w:t>Python Validation</w:t>
+            </w:r>
+            <w:r>
+              <w:t>、</w:t>
+            </w:r>
+            <w:r>
+              <w:t>dbt Tests</w:t>
+            </w:r>
+          </w:p>
+        </w:tc>
+        <w:tc>
+          <w:tcPr>
+            <w:tcW w:w="2693" w:type="dxa"/>
+          </w:tcPr>
+          <w:p>
+            <w:r>
+              <w:t>字段空值、重复记录、价格有效范围、</w:t>
+            </w:r>
+            <w:proofErr w:type="gramStart"/>
+            <w:r>
+              <w:t>主外键关系</w:t>
+            </w:r>
+            <w:proofErr w:type="gramEnd"/>
+            <w:r>
+              <w:t>、数据完整性</w:t>
+            </w:r>
+          </w:p>
+        </w:tc>
+        <w:tc>
+          <w:tcPr>
+            <w:tcW w:w="2410" w:type="dxa"/>
+          </w:tcPr>
+          <w:p>
+            <w:r>
+              <w:t>异常数据隔离或阻止发布；</w:t>
+            </w:r>
+            <w:r>
+              <w:t xml:space="preserve">dbt </w:t>
+            </w:r>
+            <w:r>
+              <w:t>测试失败触发</w:t>
+            </w:r>
+            <w:r>
+              <w:t xml:space="preserve"> Airflow </w:t>
+            </w:r>
+            <w:r>
+              <w:t>告警</w:t>
+            </w:r>
+          </w:p>
+        </w:tc>
+      </w:tr>
+      <w:tr>
+        <w:tc>
+          <w:tcPr>
+            <w:tcW w:w="1838" w:type="dxa"/>
+          </w:tcPr>
+          <w:p>
+            <w:r>
+              <w:t>ETL &amp; Workflow Monitoring</w:t>
+            </w:r>
+          </w:p>
+        </w:tc>
+        <w:tc>
+          <w:tcPr>
+            <w:tcW w:w="1843" w:type="dxa"/>
+          </w:tcPr>
+          <w:p>
+            <w:r>
+              <w:t>Apache Airflow</w:t>
+            </w:r>
+            <w:r>
+              <w:t>、</w:t>
+            </w:r>
+            <w:r>
+              <w:t>dbt</w:t>
+            </w:r>
+          </w:p>
+        </w:tc>
+        <w:tc>
+          <w:tcPr>
+            <w:tcW w:w="2693" w:type="dxa"/>
+          </w:tcPr>
+          <w:p>
+            <w:r>
+              <w:t xml:space="preserve">DAG </w:t>
+            </w:r>
+            <w:r>
+              <w:t>执行状态、</w:t>
+            </w:r>
+            <w:r>
+              <w:t>Task Duration</w:t>
+            </w:r>
+            <w:r>
+              <w:t>、</w:t>
+            </w:r>
+            <w:r>
+              <w:t>Retry Count</w:t>
+            </w:r>
+            <w:r>
+              <w:t>、</w:t>
+            </w:r>
+            <w:r>
+              <w:t xml:space="preserve">dbt Transformation </w:t>
+            </w:r>
+            <w:r>
+              <w:t>结果</w:t>
+            </w:r>
+          </w:p>
+        </w:tc>
+        <w:tc>
+          <w:tcPr>
+            <w:tcW w:w="2410" w:type="dxa"/>
+          </w:tcPr>
+          <w:p>
+            <w:r>
+              <w:t>失败任务自动重试；最终失败通过</w:t>
+            </w:r>
+            <w:r>
+              <w:t xml:space="preserve"> SNS </w:t>
+            </w:r>
+            <w:r>
+              <w:t>发送告警，支持从</w:t>
+            </w:r>
+            <w:r>
+              <w:t xml:space="preserve"> S3 </w:t>
+            </w:r>
+            <w:r>
+              <w:t>重新处理数据</w:t>
+            </w:r>
+          </w:p>
+        </w:tc>
+      </w:tr>
+      <w:tr>
+        <w:tc>
+          <w:tcPr>
+            <w:tcW w:w="1838" w:type="dxa"/>
+          </w:tcPr>
+          <w:p>
+            <w:r>
+              <w:t>Data Freshness Monitoring</w:t>
+            </w:r>
+          </w:p>
+        </w:tc>
+        <w:tc>
+          <w:tcPr>
+            <w:tcW w:w="1843" w:type="dxa"/>
+          </w:tcPr>
+          <w:p>
+            <w:r>
+              <w:t>Python</w:t>
+            </w:r>
+            <w:r>
+              <w:t>、</w:t>
+            </w:r>
+            <w:r>
+              <w:t>SQL</w:t>
+            </w:r>
+            <w:r>
+              <w:t>、</w:t>
+            </w:r>
+            <w:r>
+              <w:t>Airflow</w:t>
+            </w:r>
+          </w:p>
+        </w:tc>
+        <w:tc>
+          <w:tcPr>
+            <w:tcW w:w="2693" w:type="dxa"/>
+          </w:tcPr>
+          <w:p>
+            <w:r>
+              <w:t>各市场报价更新时间、</w:t>
+            </w:r>
+            <w:r>
+              <w:t xml:space="preserve">price_latest </w:t>
+            </w:r>
+            <w:r>
+              <w:t>更新时间、</w:t>
+            </w:r>
+            <w:r>
+              <w:t xml:space="preserve">Gold </w:t>
+            </w:r>
+            <w:r>
+              <w:t>数据完整性</w:t>
+            </w:r>
+          </w:p>
+        </w:tc>
+        <w:tc>
+          <w:tcPr>
+            <w:tcW w:w="2410" w:type="dxa"/>
+          </w:tcPr>
+          <w:p>
+            <w:r>
+              <w:t>根据市场更新频率识别过期报价；标记</w:t>
+            </w:r>
+            <w:r>
+              <w:t xml:space="preserve"> Stale Data</w:t>
+            </w:r>
+            <w:r>
+              <w:t>，关键数据未更新时发送告警</w:t>
+            </w:r>
+          </w:p>
+        </w:tc>
+      </w:tr>
+      <w:tr>
+        <w:tc>
+          <w:tcPr>
+            <w:tcW w:w="1838" w:type="dxa"/>
+          </w:tcPr>
+          <w:p>
+            <w:r>
+              <w:t>PostgreSQL Performance Monitoring</w:t>
+            </w:r>
+          </w:p>
+        </w:tc>
+        <w:tc>
+          <w:tcPr>
+            <w:tcW w:w="1843" w:type="dxa"/>
+          </w:tcPr>
+          <w:p>
+            <w:r>
+              <w:t>PostgreSQL Statistics</w:t>
+            </w:r>
+            <w:r>
+              <w:t>、</w:t>
+            </w:r>
+            <w:r>
+              <w:t>SQL</w:t>
+            </w:r>
+          </w:p>
+        </w:tc>
+        <w:tc>
+          <w:tcPr>
+            <w:tcW w:w="2693" w:type="dxa"/>
+          </w:tcPr>
+          <w:p>
+            <w:r>
+              <w:t>数据库容量、查询延迟、连接数量、慢查询、历史</w:t>
+            </w:r>
+            <w:proofErr w:type="gramStart"/>
+            <w:r>
+              <w:t>表增长</w:t>
+            </w:r>
+            <w:proofErr w:type="gramEnd"/>
+            <w:r>
+              <w:t>量</w:t>
+            </w:r>
+          </w:p>
+        </w:tc>
+        <w:tc>
+          <w:tcPr>
+            <w:tcW w:w="2410" w:type="dxa"/>
+          </w:tcPr>
+          <w:p>
+            <w:r>
+              <w:t>分析异常查询，优化</w:t>
+            </w:r>
+            <w:r>
+              <w:t xml:space="preserve"> SQL</w:t>
+            </w:r>
+            <w:r>
+              <w:t>、</w:t>
+            </w:r>
+            <w:r>
+              <w:t xml:space="preserve">Indexes </w:t>
+            </w:r>
+            <w:r>
+              <w:t>和</w:t>
+            </w:r>
+            <w:r>
+              <w:t xml:space="preserve"> Partitioning</w:t>
+            </w:r>
+            <w:r>
+              <w:t>；必要时调整数据库资源</w:t>
+            </w:r>
+          </w:p>
+        </w:tc>
+      </w:tr>
+      <w:tr>
+        <w:tc>
+          <w:tcPr>
+            <w:tcW w:w="1838" w:type="dxa"/>
+          </w:tcPr>
+          <w:p>
+            <w:r>
+              <w:t>AWS Cost Monitoring</w:t>
+            </w:r>
+          </w:p>
+        </w:tc>
+        <w:tc>
+          <w:tcPr>
+            <w:tcW w:w="1843" w:type="dxa"/>
+          </w:tcPr>
+          <w:p>
+            <w:r>
+              <w:t>AWS Budgets</w:t>
+            </w:r>
+            <w:r>
+              <w:t>、</w:t>
+            </w:r>
+            <w:r>
+              <w:t>CloudWatch</w:t>
+            </w:r>
+          </w:p>
+        </w:tc>
+        <w:tc>
+          <w:tcPr>
+            <w:tcW w:w="2693" w:type="dxa"/>
+          </w:tcPr>
+          <w:p>
+            <w:r>
+              <w:t>每月</w:t>
+            </w:r>
+            <w:r>
+              <w:t xml:space="preserve"> AWS </w:t>
+            </w:r>
+            <w:r>
+              <w:t>费用、各服务费用、预算使用比例</w:t>
+            </w:r>
+          </w:p>
+        </w:tc>
+        <w:tc>
+          <w:tcPr>
+            <w:tcW w:w="2410" w:type="dxa"/>
+          </w:tcPr>
+          <w:p>
+            <w:r>
+              <w:t>达到月度预算的</w:t>
+            </w:r>
+            <w:r>
+              <w:t xml:space="preserve"> 50%</w:t>
+            </w:r>
+            <w:r>
+              <w:t>、</w:t>
+            </w:r>
+            <w:r>
+              <w:t>80%</w:t>
+            </w:r>
+            <w:r>
+              <w:t>、</w:t>
+            </w:r>
+            <w:r>
+              <w:t xml:space="preserve">100% </w:t>
+            </w:r>
+            <w:r>
+              <w:t>时发送邮件通知，检查异常费用</w:t>
+            </w:r>
+          </w:p>
+        </w:tc>
+      </w:tr>
+    </w:tbl>
+    <w:p/>
     <w:sectPr>
       <w:pgSz w:w="12240" w:h="15840"/>
       <w:pgMar w:top="1440" w:right="1800" w:bottom="1440" w:left="1800" w:header="720" w:footer="720" w:gutter="0"/>
@@ -3785,6 +5157,7 @@
   <w:style w:type="character" w:default="1" w:styleId="a0">
     <w:name w:val="Default Paragraph Font"/>
     <w:uiPriority w:val="1"/>
+    <w:semiHidden/>
     <w:unhideWhenUsed/>
   </w:style>
   <w:style w:type="table" w:default="1" w:styleId="a1">
@@ -4132,6 +5505,19 @@
       </w:tblBorders>
     </w:tblPr>
   </w:style>
+  <w:style w:type="character" w:styleId="HTML">
+    <w:name w:val="HTML Code"/>
+    <w:basedOn w:val="a0"/>
+    <w:uiPriority w:val="99"/>
+    <w:semiHidden/>
+    <w:unhideWhenUsed/>
+    <w:rsid w:val="00682BB2"/>
+    <w:rPr>
+      <w:rFonts w:ascii="Courier New" w:eastAsia="Times New Roman" w:hAnsi="Courier New" w:cs="Courier New"/>
+      <w:sz w:val="20"/>
+      <w:szCs w:val="20"/>
+    </w:rPr>
+  </w:style>
 </w:styles>
 </file>
 

</xml_diff>